<commit_message>
Add Fullstack and Frontend documents in PDF and DOCX formats
</commit_message>
<xml_diff>
--- a/Khairul Hasan - Frontend.docx
+++ b/Khairul Hasan - Frontend.docx
@@ -556,8 +556,6 @@
                 <w:rFonts w:ascii="Nunito" w:cs="Nunito" w:eastAsia="Nunito" w:hAnsi="Nunito"/>
                 <w:b w:val="1"/>
                 <w:bCs w:val="1"/>
-                <w:i w:val="1"/>
-                <w:iCs w:val="1"/>
                 <w:sz w:val="18"/>
                 <w:szCs w:val="18"/>
                 <w:rtl w:val="0"/>
@@ -952,13 +950,24 @@
                 <w:rFonts w:ascii="Nunito" w:cs="Nunito" w:eastAsia="Nunito" w:hAnsi="Nunito"/>
                 <w:b w:val="1"/>
                 <w:bCs w:val="1"/>
+                <w:sz w:val="18"/>
+                <w:szCs w:val="18"/>
+                <w:rtl w:val="0"/>
+              </w:rPr>
+              <w:t xml:space="preserve">Senior Software Developer (Part-time)</w:t>
+            </w:r>
+            <w:r>
+              <w:rPr>
+                <w:rFonts w:ascii="Nunito" w:cs="Nunito" w:eastAsia="Nunito" w:hAnsi="Nunito"/>
+                <w:b w:val="1"/>
+                <w:bCs w:val="1"/>
                 <w:i w:val="1"/>
                 <w:iCs w:val="1"/>
                 <w:sz w:val="18"/>
                 <w:szCs w:val="18"/>
                 <w:rtl w:val="0"/>
               </w:rPr>
-              <w:t xml:space="preserve">Senior Software Developer (Part-time) — </w:t>
+              <w:t xml:space="preserve"> — </w:t>
             </w:r>
             <w:hyperlink r:id="rId7">
               <w:r>
@@ -3322,12 +3331,12 @@
         <wp:inline distB="114300" distT="114300" distL="114300" distR="114300">
           <wp:extent cx="91440" cy="91440"/>
           <wp:effectExtent b="0" l="0" r="0" t="0"/>
-          <wp:docPr id="4" name="image5.png"/>
+          <wp:docPr id="4" name="image3.png"/>
           <a:graphic>
             <a:graphicData uri="http://schemas.openxmlformats.org/drawingml/2006/picture">
               <pic:pic>
                 <pic:nvPicPr>
-                  <pic:cNvPr id="0" name="image5.png"/>
+                  <pic:cNvPr id="0" name="image3.png"/>
                   <pic:cNvPicPr preferRelativeResize="0"/>
                 </pic:nvPicPr>
                 <pic:blipFill>
@@ -3392,12 +3401,12 @@
         <wp:inline distB="114300" distT="114300" distL="114300" distR="114300">
           <wp:extent cx="91440" cy="91440"/>
           <wp:effectExtent b="0" l="0" r="0" t="0"/>
-          <wp:docPr id="5" name="image1.png"/>
+          <wp:docPr id="5" name="image2.png"/>
           <a:graphic>
             <a:graphicData uri="http://schemas.openxmlformats.org/drawingml/2006/picture">
               <pic:pic>
                 <pic:nvPicPr>
-                  <pic:cNvPr id="0" name="image1.png"/>
+                  <pic:cNvPr id="0" name="image2.png"/>
                   <pic:cNvPicPr preferRelativeResize="0"/>
                 </pic:nvPicPr>
                 <pic:blipFill>
@@ -3459,12 +3468,12 @@
         <wp:inline distB="114300" distT="114300" distL="114300" distR="114300">
           <wp:extent cx="91440" cy="91440"/>
           <wp:effectExtent b="0" l="0" r="0" t="0"/>
-          <wp:docPr id="2" name="image3.png"/>
+          <wp:docPr id="2" name="image4.png"/>
           <a:graphic>
             <a:graphicData uri="http://schemas.openxmlformats.org/drawingml/2006/picture">
               <pic:pic>
                 <pic:nvPicPr>
-                  <pic:cNvPr id="0" name="image3.png"/>
+                  <pic:cNvPr id="0" name="image4.png"/>
                   <pic:cNvPicPr preferRelativeResize="0"/>
                 </pic:nvPicPr>
                 <pic:blipFill>
@@ -3529,12 +3538,12 @@
         <wp:inline distB="114300" distT="114300" distL="114300" distR="114300">
           <wp:extent cx="91440" cy="91440"/>
           <wp:effectExtent b="0" l="0" r="0" t="0"/>
-          <wp:docPr id="3" name="image4.png"/>
+          <wp:docPr id="3" name="image5.png"/>
           <a:graphic>
             <a:graphicData uri="http://schemas.openxmlformats.org/drawingml/2006/picture">
               <pic:pic>
                 <pic:nvPicPr>
-                  <pic:cNvPr id="0" name="image4.png"/>
+                  <pic:cNvPr id="0" name="image5.png"/>
                   <pic:cNvPicPr preferRelativeResize="0"/>
                 </pic:nvPicPr>
                 <pic:blipFill>
@@ -3599,12 +3608,12 @@
         <wp:inline distB="114300" distT="114300" distL="114300" distR="114300">
           <wp:extent cx="100584" cy="100584"/>
           <wp:effectExtent b="0" l="0" r="0" t="0"/>
-          <wp:docPr id="1" name="image2.png"/>
+          <wp:docPr id="1" name="image1.png"/>
           <a:graphic>
             <a:graphicData uri="http://schemas.openxmlformats.org/drawingml/2006/picture">
               <pic:pic>
                 <pic:nvPicPr>
-                  <pic:cNvPr id="0" name="image2.png"/>
+                  <pic:cNvPr id="0" name="image1.png"/>
                   <pic:cNvPicPr preferRelativeResize="0"/>
                 </pic:nvPicPr>
                 <pic:blipFill>

</xml_diff>